<commit_message>
Chuyen THCS sang Phuong an B: bang 3 cot (Buoc|HĐ GV|HD HS), cap nhat KHBD_THCS.md, tai tao 18 KHBD
</commit_message>
<xml_diff>
--- a/KHBD_Tin_học/Lớp_6/Bài_01/KHBD_Tin_hoc_Lớp_6_Bai01_Thông_tin_và_dữ_liệu.docx
+++ b/KHBD_Tin_học/Lớp_6/Bài_01/KHBD_Tin_hoc_Lớp_6_Bai01_Thông_tin_và_dữ_liệu.docx
@@ -757,93 +757,388 @@
         <w:t>GV chiếu câu hỏi tình huống, yêu cầu HS thảo luận cặp đôi trong 2 phút.</w:t>
       </w:r>
     </w:p>
-    <w:p>
-      <w:pPr>
-        <w:spacing w:after="0" w:line="276" w:lineRule="auto"/>
-        <w:ind w:firstLine="567"/>
-      </w:pPr>
-      <w:r>
-        <w:rPr>
-          <w:rFonts w:ascii="Times New Roman" w:hAnsi="Times New Roman" w:cs="Times New Roman" w:eastAsia="Times New Roman"/>
-          <w:i/>
-          <w:sz w:val="26"/>
-        </w:rPr>
-        <w:t>Bước 1. Chuyển giao nhiệm vụ học tập</w:t>
-      </w:r>
-      <w:r>
-        <w:rPr>
-          <w:rFonts w:ascii="Times New Roman" w:hAnsi="Times New Roman" w:cs="Times New Roman" w:eastAsia="Times New Roman"/>
-          <w:sz w:val="26"/>
-        </w:rPr>
-        <w:br/>
-        <w:t>GV chiếu hình ảnh: dãy số "36.5" và hỏi "Đây là gì? Có nghĩa là gì?"</w:t>
-      </w:r>
-    </w:p>
-    <w:p>
-      <w:pPr>
-        <w:spacing w:after="0" w:line="276" w:lineRule="auto"/>
-        <w:ind w:firstLine="567"/>
-      </w:pPr>
-      <w:r>
-        <w:rPr>
-          <w:rFonts w:ascii="Times New Roman" w:hAnsi="Times New Roman" w:cs="Times New Roman" w:eastAsia="Times New Roman"/>
-          <w:i/>
-          <w:sz w:val="26"/>
-        </w:rPr>
-        <w:t>Bước 2. Học sinh tiếp nhận nhiệm vụ học tập</w:t>
-      </w:r>
-      <w:r>
-        <w:rPr>
-          <w:rFonts w:ascii="Times New Roman" w:hAnsi="Times New Roman" w:cs="Times New Roman" w:eastAsia="Times New Roman"/>
-          <w:sz w:val="26"/>
-        </w:rPr>
-        <w:br/>
-        <w:t>HS nhận câu hỏi, thảo luận cặp đôi, mỗi cặp nêu ít nhất 1 cách hiểu.</w:t>
-      </w:r>
-    </w:p>
-    <w:p>
-      <w:pPr>
-        <w:spacing w:after="0" w:line="276" w:lineRule="auto"/>
-        <w:ind w:firstLine="567"/>
-      </w:pPr>
-      <w:r>
-        <w:rPr>
-          <w:rFonts w:ascii="Times New Roman" w:hAnsi="Times New Roman" w:cs="Times New Roman" w:eastAsia="Times New Roman"/>
-          <w:i/>
-          <w:sz w:val="26"/>
-        </w:rPr>
-        <w:t>Bước 3. Báo cáo kết quả hoạt động</w:t>
-      </w:r>
-      <w:r>
-        <w:rPr>
-          <w:rFonts w:ascii="Times New Roman" w:hAnsi="Times New Roman" w:cs="Times New Roman" w:eastAsia="Times New Roman"/>
-          <w:sz w:val="26"/>
-        </w:rPr>
-        <w:br/>
-        <w:t>2-3 cặp HS trình bày, HS khác nhận xét.</w:t>
-      </w:r>
-    </w:p>
-    <w:p>
-      <w:pPr>
-        <w:spacing w:after="0" w:line="276" w:lineRule="auto"/>
-        <w:ind w:firstLine="567"/>
-      </w:pPr>
-      <w:r>
-        <w:rPr>
-          <w:rFonts w:ascii="Times New Roman" w:hAnsi="Times New Roman" w:cs="Times New Roman" w:eastAsia="Times New Roman"/>
-          <w:i/>
-          <w:sz w:val="26"/>
-        </w:rPr>
-        <w:t>Bước 4. Đánh giá kết quả thực hiện nhiệm vụ</w:t>
-      </w:r>
-      <w:r>
-        <w:rPr>
-          <w:rFonts w:ascii="Times New Roman" w:hAnsi="Times New Roman" w:cs="Times New Roman" w:eastAsia="Times New Roman"/>
-          <w:sz w:val="26"/>
-        </w:rPr>
-        <w:br/>
-        <w:t>GV nhận xét, nhấn mạnh: cùng 1 dữ liệu nhưng có thể mang nhiều ý nghĩa khác nhau tùy ngữ cảnh → Dẫn vào bài.</w:t>
-      </w:r>
+    <w:tbl>
+      <w:tblPr>
+        <w:tblW w:type="auto" w:w="0"/>
+        <w:tblLook w:firstColumn="1" w:firstRow="1" w:lastColumn="0" w:lastRow="0" w:noHBand="0" w:noVBand="1" w:val="04A0"/>
+        <w:tblBorders>
+          <w:top w:val="single" w:sz="4" w:color="000000" w:space="0"/>
+          <w:left w:val="single" w:sz="4" w:color="000000" w:space="0"/>
+          <w:bottom w:val="single" w:sz="4" w:color="000000" w:space="0"/>
+          <w:right w:val="single" w:sz="4" w:color="000000" w:space="0"/>
+          <w:insideH w:val="single" w:sz="4" w:color="000000" w:space="0"/>
+          <w:insideV w:val="single" w:sz="4" w:color="000000" w:space="0"/>
+        </w:tblBorders>
+      </w:tblPr>
+      <w:tblGrid>
+        <w:gridCol w:w="1805"/>
+        <w:gridCol w:w="3610"/>
+        <w:gridCol w:w="3611"/>
+      </w:tblGrid>
+      <w:tblGrid>
+        <w:gridCol w:w="3198"/>
+        <w:gridCol w:w="3198"/>
+        <w:gridCol w:w="3198"/>
+      </w:tblGrid>
+      <w:tr>
+        <w:tc>
+          <w:tcPr>
+            <w:tcW w:type="dxa" w:w="3198"/>
+          </w:tcPr>
+          <w:p>
+            <w:pPr>
+              <w:spacing w:line="276" w:lineRule="auto"/>
+              <w:jc w:val="center"/>
+            </w:pPr>
+            <w:r>
+              <w:rPr>
+                <w:rFonts w:ascii="Times New Roman" w:hAnsi="Times New Roman" w:cs="Times New Roman" w:eastAsia="Times New Roman"/>
+                <w:b/>
+                <w:i w:val="0"/>
+                <w:sz w:val="26"/>
+              </w:rPr>
+              <w:t>Bước</w:t>
+            </w:r>
+          </w:p>
+        </w:tc>
+        <w:tc>
+          <w:tcPr>
+            <w:tcW w:type="dxa" w:w="3198"/>
+          </w:tcPr>
+          <w:p>
+            <w:pPr>
+              <w:spacing w:line="276" w:lineRule="auto"/>
+              <w:jc w:val="center"/>
+            </w:pPr>
+            <w:r>
+              <w:rPr>
+                <w:rFonts w:ascii="Times New Roman" w:hAnsi="Times New Roman" w:cs="Times New Roman" w:eastAsia="Times New Roman"/>
+                <w:b/>
+                <w:i w:val="0"/>
+                <w:sz w:val="26"/>
+              </w:rPr>
+              <w:t>Hoạt động của GV</w:t>
+            </w:r>
+          </w:p>
+        </w:tc>
+        <w:tc>
+          <w:tcPr>
+            <w:tcW w:type="dxa" w:w="3198"/>
+          </w:tcPr>
+          <w:p>
+            <w:pPr>
+              <w:spacing w:line="276" w:lineRule="auto"/>
+              <w:jc w:val="center"/>
+            </w:pPr>
+            <w:r>
+              <w:rPr>
+                <w:rFonts w:ascii="Times New Roman" w:hAnsi="Times New Roman" w:cs="Times New Roman" w:eastAsia="Times New Roman"/>
+                <w:b/>
+                <w:i w:val="0"/>
+                <w:sz w:val="26"/>
+              </w:rPr>
+              <w:t>Hoạt động của HS</w:t>
+            </w:r>
+          </w:p>
+        </w:tc>
+      </w:tr>
+      <w:tr>
+        <w:tc>
+          <w:tcPr>
+            <w:tcW w:type="dxa" w:w="1805"/>
+          </w:tcPr>
+          <w:p>
+            <w:pPr>
+              <w:spacing w:line="276" w:lineRule="auto"/>
+              <w:jc w:val="center"/>
+            </w:pPr>
+            <w:r>
+              <w:rPr>
+                <w:rFonts w:ascii="Times New Roman" w:hAnsi="Times New Roman" w:cs="Times New Roman" w:eastAsia="Times New Roman"/>
+                <w:b/>
+                <w:i/>
+                <w:sz w:val="26"/>
+              </w:rPr>
+              <w:t>Bước 1:</w:t>
+            </w:r>
+          </w:p>
+          <w:p>
+            <w:r>
+              <w:rPr>
+                <w:rFonts w:ascii="Times New Roman" w:hAnsi="Times New Roman" w:cs="Times New Roman" w:eastAsia="Times New Roman"/>
+                <w:b/>
+                <w:i/>
+                <w:sz w:val="26"/>
+              </w:rPr>
+              <w:t>Chuyển giao</w:t>
+            </w:r>
+          </w:p>
+          <w:p>
+            <w:r>
+              <w:rPr>
+                <w:rFonts w:ascii="Times New Roman" w:hAnsi="Times New Roman" w:cs="Times New Roman" w:eastAsia="Times New Roman"/>
+                <w:b/>
+                <w:i/>
+                <w:sz w:val="26"/>
+              </w:rPr>
+              <w:t>nhiệm vụ học tập</w:t>
+            </w:r>
+          </w:p>
+        </w:tc>
+        <w:tc>
+          <w:tcPr>
+            <w:tcW w:type="dxa" w:w="3610"/>
+          </w:tcPr>
+          <w:p>
+            <w:pPr>
+              <w:spacing w:line="276" w:lineRule="auto"/>
+            </w:pPr>
+            <w:r>
+              <w:rPr>
+                <w:rFonts w:ascii="Times New Roman" w:hAnsi="Times New Roman" w:cs="Times New Roman" w:eastAsia="Times New Roman"/>
+                <w:b w:val="0"/>
+                <w:i w:val="0"/>
+                <w:sz w:val="26"/>
+              </w:rPr>
+              <w:t>GV chiếu hình ảnh: dãy số "36.5" và hỏi "Đây là gì? Có nghĩa là gì?"</w:t>
+            </w:r>
+          </w:p>
+        </w:tc>
+        <w:tc>
+          <w:tcPr>
+            <w:tcW w:type="dxa" w:w="3611"/>
+          </w:tcPr>
+          <w:p>
+            <w:pPr>
+              <w:spacing w:line="276" w:lineRule="auto"/>
+            </w:pPr>
+          </w:p>
+        </w:tc>
+      </w:tr>
+      <w:tr>
+        <w:tc>
+          <w:tcPr>
+            <w:tcW w:type="dxa" w:w="1805"/>
+          </w:tcPr>
+          <w:p>
+            <w:pPr>
+              <w:spacing w:line="276" w:lineRule="auto"/>
+              <w:jc w:val="center"/>
+            </w:pPr>
+            <w:r>
+              <w:rPr>
+                <w:rFonts w:ascii="Times New Roman" w:hAnsi="Times New Roman" w:cs="Times New Roman" w:eastAsia="Times New Roman"/>
+                <w:b/>
+                <w:i/>
+                <w:sz w:val="26"/>
+              </w:rPr>
+              <w:t>Bước 2:</w:t>
+            </w:r>
+          </w:p>
+          <w:p>
+            <w:r>
+              <w:rPr>
+                <w:rFonts w:ascii="Times New Roman" w:hAnsi="Times New Roman" w:cs="Times New Roman" w:eastAsia="Times New Roman"/>
+                <w:b/>
+                <w:i/>
+                <w:sz w:val="26"/>
+              </w:rPr>
+              <w:t>Học sinh tiếp nhận</w:t>
+            </w:r>
+          </w:p>
+          <w:p>
+            <w:r>
+              <w:rPr>
+                <w:rFonts w:ascii="Times New Roman" w:hAnsi="Times New Roman" w:cs="Times New Roman" w:eastAsia="Times New Roman"/>
+                <w:b/>
+                <w:i/>
+                <w:sz w:val="26"/>
+              </w:rPr>
+              <w:t>nhiệm vụ học tập</w:t>
+            </w:r>
+          </w:p>
+        </w:tc>
+        <w:tc>
+          <w:tcPr>
+            <w:tcW w:type="dxa" w:w="3610"/>
+          </w:tcPr>
+          <w:p>
+            <w:pPr>
+              <w:spacing w:line="276" w:lineRule="auto"/>
+            </w:pPr>
+            <w:r>
+              <w:rPr>
+                <w:rFonts w:ascii="Times New Roman" w:hAnsi="Times New Roman" w:cs="Times New Roman" w:eastAsia="Times New Roman"/>
+                <w:b w:val="0"/>
+                <w:i w:val="0"/>
+                <w:sz w:val="26"/>
+              </w:rPr>
+              <w:t>HS nhận câu hỏi, thảo luận cặp đôi, mỗi cặp nêu ít nhất 1 cách hiểu.</w:t>
+            </w:r>
+          </w:p>
+        </w:tc>
+        <w:tc>
+          <w:tcPr>
+            <w:tcW w:type="dxa" w:w="3611"/>
+          </w:tcPr>
+          <w:p>
+            <w:pPr>
+              <w:spacing w:line="276" w:lineRule="auto"/>
+            </w:pPr>
+          </w:p>
+        </w:tc>
+      </w:tr>
+      <w:tr>
+        <w:tc>
+          <w:tcPr>
+            <w:tcW w:type="dxa" w:w="1805"/>
+          </w:tcPr>
+          <w:p>
+            <w:pPr>
+              <w:spacing w:line="276" w:lineRule="auto"/>
+              <w:jc w:val="center"/>
+            </w:pPr>
+            <w:r>
+              <w:rPr>
+                <w:rFonts w:ascii="Times New Roman" w:hAnsi="Times New Roman" w:cs="Times New Roman" w:eastAsia="Times New Roman"/>
+                <w:b/>
+                <w:i/>
+                <w:sz w:val="26"/>
+              </w:rPr>
+              <w:t>Bước 3:</w:t>
+            </w:r>
+          </w:p>
+          <w:p>
+            <w:r>
+              <w:rPr>
+                <w:rFonts w:ascii="Times New Roman" w:hAnsi="Times New Roman" w:cs="Times New Roman" w:eastAsia="Times New Roman"/>
+                <w:b/>
+                <w:i/>
+                <w:sz w:val="26"/>
+              </w:rPr>
+              <w:t>Báo cáo kết quả</w:t>
+            </w:r>
+          </w:p>
+          <w:p>
+            <w:r>
+              <w:rPr>
+                <w:rFonts w:ascii="Times New Roman" w:hAnsi="Times New Roman" w:cs="Times New Roman" w:eastAsia="Times New Roman"/>
+                <w:b/>
+                <w:i/>
+                <w:sz w:val="26"/>
+              </w:rPr>
+              <w:t>hoạt động</w:t>
+            </w:r>
+          </w:p>
+        </w:tc>
+        <w:tc>
+          <w:tcPr>
+            <w:tcW w:type="dxa" w:w="3610"/>
+          </w:tcPr>
+          <w:p>
+            <w:pPr>
+              <w:spacing w:line="276" w:lineRule="auto"/>
+            </w:pPr>
+            <w:r>
+              <w:rPr>
+                <w:rFonts w:ascii="Times New Roman" w:hAnsi="Times New Roman" w:cs="Times New Roman" w:eastAsia="Times New Roman"/>
+                <w:b w:val="0"/>
+                <w:i w:val="0"/>
+                <w:sz w:val="26"/>
+              </w:rPr>
+              <w:t>2-3 cặp HS trình bày, HS khác nhận xét.</w:t>
+            </w:r>
+          </w:p>
+        </w:tc>
+        <w:tc>
+          <w:tcPr>
+            <w:tcW w:type="dxa" w:w="3611"/>
+          </w:tcPr>
+          <w:p>
+            <w:pPr>
+              <w:spacing w:line="276" w:lineRule="auto"/>
+            </w:pPr>
+          </w:p>
+        </w:tc>
+      </w:tr>
+      <w:tr>
+        <w:tc>
+          <w:tcPr>
+            <w:tcW w:type="dxa" w:w="1805"/>
+          </w:tcPr>
+          <w:p>
+            <w:pPr>
+              <w:spacing w:line="276" w:lineRule="auto"/>
+              <w:jc w:val="center"/>
+            </w:pPr>
+            <w:r>
+              <w:rPr>
+                <w:rFonts w:ascii="Times New Roman" w:hAnsi="Times New Roman" w:cs="Times New Roman" w:eastAsia="Times New Roman"/>
+                <w:b/>
+                <w:i/>
+                <w:sz w:val="26"/>
+              </w:rPr>
+              <w:t>Bước 4:</w:t>
+            </w:r>
+          </w:p>
+          <w:p>
+            <w:r>
+              <w:rPr>
+                <w:rFonts w:ascii="Times New Roman" w:hAnsi="Times New Roman" w:cs="Times New Roman" w:eastAsia="Times New Roman"/>
+                <w:b/>
+                <w:i/>
+                <w:sz w:val="26"/>
+              </w:rPr>
+              <w:t>Đánh giá kết quả</w:t>
+            </w:r>
+          </w:p>
+          <w:p>
+            <w:r>
+              <w:rPr>
+                <w:rFonts w:ascii="Times New Roman" w:hAnsi="Times New Roman" w:cs="Times New Roman" w:eastAsia="Times New Roman"/>
+                <w:b/>
+                <w:i/>
+                <w:sz w:val="26"/>
+              </w:rPr>
+              <w:t>thực hiện nhiệm vụ</w:t>
+            </w:r>
+          </w:p>
+        </w:tc>
+        <w:tc>
+          <w:tcPr>
+            <w:tcW w:type="dxa" w:w="3610"/>
+          </w:tcPr>
+          <w:p>
+            <w:pPr>
+              <w:spacing w:line="276" w:lineRule="auto"/>
+            </w:pPr>
+            <w:r>
+              <w:rPr>
+                <w:rFonts w:ascii="Times New Roman" w:hAnsi="Times New Roman" w:cs="Times New Roman" w:eastAsia="Times New Roman"/>
+                <w:b w:val="0"/>
+                <w:i w:val="0"/>
+                <w:sz w:val="26"/>
+              </w:rPr>
+              <w:t>GV nhận xét, nhấn mạnh: cùng 1 dữ liệu nhưng có thể mang nhiều ý nghĩa khác nhau tùy ngữ cảnh → Dẫn vào bài.</w:t>
+            </w:r>
+          </w:p>
+        </w:tc>
+        <w:tc>
+          <w:tcPr>
+            <w:tcW w:type="dxa" w:w="3611"/>
+          </w:tcPr>
+          <w:p>
+            <w:pPr>
+              <w:spacing w:line="276" w:lineRule="auto"/>
+            </w:pPr>
+          </w:p>
+        </w:tc>
+      </w:tr>
+    </w:tbl>
+    <w:p>
+      <w:pPr>
+        <w:spacing w:line="276" w:lineRule="auto"/>
+      </w:pPr>
     </w:p>
     <w:p>
       <w:pPr>
@@ -944,93 +1239,388 @@
         <w:t>GV trình bày kiến thức kết hợp đặt câu hỏi tương tác.</w:t>
       </w:r>
     </w:p>
-    <w:p>
-      <w:pPr>
-        <w:spacing w:after="0" w:line="276" w:lineRule="auto"/>
-        <w:ind w:firstLine="567"/>
-      </w:pPr>
-      <w:r>
-        <w:rPr>
-          <w:rFonts w:ascii="Times New Roman" w:hAnsi="Times New Roman" w:cs="Times New Roman" w:eastAsia="Times New Roman"/>
-          <w:i/>
-          <w:sz w:val="26"/>
-        </w:rPr>
-        <w:t>Bước 1. Chuyển giao nhiệm vụ học tập</w:t>
-      </w:r>
-      <w:r>
-        <w:rPr>
-          <w:rFonts w:ascii="Times New Roman" w:hAnsi="Times New Roman" w:cs="Times New Roman" w:eastAsia="Times New Roman"/>
-          <w:sz w:val="26"/>
-        </w:rPr>
-        <w:br/>
-        <w:t>GV chiếu slide khái niệm: Thông tin (information) = ý nghĩa mà con người hiểu. Dữ liệu (data) = biểu diễn của thông tin trong máy tính.</w:t>
-      </w:r>
-    </w:p>
-    <w:p>
-      <w:pPr>
-        <w:spacing w:after="0" w:line="276" w:lineRule="auto"/>
-        <w:ind w:firstLine="567"/>
-      </w:pPr>
-      <w:r>
-        <w:rPr>
-          <w:rFonts w:ascii="Times New Roman" w:hAnsi="Times New Roman" w:cs="Times New Roman" w:eastAsia="Times New Roman"/>
-          <w:i/>
-          <w:sz w:val="26"/>
-        </w:rPr>
-        <w:t>Bước 2. Học sinh tiếp nhận nhiệm vụ học tập</w:t>
-      </w:r>
-      <w:r>
-        <w:rPr>
-          <w:rFonts w:ascii="Times New Roman" w:hAnsi="Times New Roman" w:cs="Times New Roman" w:eastAsia="Times New Roman"/>
-          <w:sz w:val="26"/>
-        </w:rPr>
-        <w:br/>
-        <w:t>HS đọc SGK tr.6, gạch chân định nghĩa và ví dụ. GV hỏi: "Cho ví dụ 1 thông tin và dữ liệu tương ứng."</w:t>
-      </w:r>
-    </w:p>
-    <w:p>
-      <w:pPr>
-        <w:spacing w:after="0" w:line="276" w:lineRule="auto"/>
-        <w:ind w:firstLine="567"/>
-      </w:pPr>
-      <w:r>
-        <w:rPr>
-          <w:rFonts w:ascii="Times New Roman" w:hAnsi="Times New Roman" w:cs="Times New Roman" w:eastAsia="Times New Roman"/>
-          <w:i/>
-          <w:sz w:val="26"/>
-        </w:rPr>
-        <w:t>Bước 3. Báo cáo kết quả hoạt động</w:t>
-      </w:r>
-      <w:r>
-        <w:rPr>
-          <w:rFonts w:ascii="Times New Roman" w:hAnsi="Times New Roman" w:cs="Times New Roman" w:eastAsia="Times New Roman"/>
-          <w:sz w:val="26"/>
-        </w:rPr>
-        <w:br/>
-        <w:t>HS trả lời cá nhân, GV gọi 3-4 HS. GV giới thiệu 5 dạng: số, văn bản, hình ảnh, âm thanh, video.</w:t>
-      </w:r>
-    </w:p>
-    <w:p>
-      <w:pPr>
-        <w:spacing w:after="0" w:line="276" w:lineRule="auto"/>
-        <w:ind w:firstLine="567"/>
-      </w:pPr>
-      <w:r>
-        <w:rPr>
-          <w:rFonts w:ascii="Times New Roman" w:hAnsi="Times New Roman" w:cs="Times New Roman" w:eastAsia="Times New Roman"/>
-          <w:i/>
-          <w:sz w:val="26"/>
-        </w:rPr>
-        <w:t>Bước 4. Đánh giá kết quả thực hiện nhiệm vụ</w:t>
-      </w:r>
-      <w:r>
-        <w:rPr>
-          <w:rFonts w:ascii="Times New Roman" w:hAnsi="Times New Roman" w:cs="Times New Roman" w:eastAsia="Times New Roman"/>
-          <w:sz w:val="26"/>
-        </w:rPr>
-        <w:br/>
-        <w:t>GV tổng kết, HS ghi vào vở định nghĩa và bảng 5 dạng dữ liệu.</w:t>
-      </w:r>
+    <w:tbl>
+      <w:tblPr>
+        <w:tblW w:type="auto" w:w="0"/>
+        <w:tblLook w:firstColumn="1" w:firstRow="1" w:lastColumn="0" w:lastRow="0" w:noHBand="0" w:noVBand="1" w:val="04A0"/>
+        <w:tblBorders>
+          <w:top w:val="single" w:sz="4" w:color="000000" w:space="0"/>
+          <w:left w:val="single" w:sz="4" w:color="000000" w:space="0"/>
+          <w:bottom w:val="single" w:sz="4" w:color="000000" w:space="0"/>
+          <w:right w:val="single" w:sz="4" w:color="000000" w:space="0"/>
+          <w:insideH w:val="single" w:sz="4" w:color="000000" w:space="0"/>
+          <w:insideV w:val="single" w:sz="4" w:color="000000" w:space="0"/>
+        </w:tblBorders>
+      </w:tblPr>
+      <w:tblGrid>
+        <w:gridCol w:w="1805"/>
+        <w:gridCol w:w="3610"/>
+        <w:gridCol w:w="3611"/>
+      </w:tblGrid>
+      <w:tblGrid>
+        <w:gridCol w:w="3198"/>
+        <w:gridCol w:w="3198"/>
+        <w:gridCol w:w="3198"/>
+      </w:tblGrid>
+      <w:tr>
+        <w:tc>
+          <w:tcPr>
+            <w:tcW w:type="dxa" w:w="3198"/>
+          </w:tcPr>
+          <w:p>
+            <w:pPr>
+              <w:spacing w:line="276" w:lineRule="auto"/>
+              <w:jc w:val="center"/>
+            </w:pPr>
+            <w:r>
+              <w:rPr>
+                <w:rFonts w:ascii="Times New Roman" w:hAnsi="Times New Roman" w:cs="Times New Roman" w:eastAsia="Times New Roman"/>
+                <w:b/>
+                <w:i w:val="0"/>
+                <w:sz w:val="26"/>
+              </w:rPr>
+              <w:t>Bước</w:t>
+            </w:r>
+          </w:p>
+        </w:tc>
+        <w:tc>
+          <w:tcPr>
+            <w:tcW w:type="dxa" w:w="3198"/>
+          </w:tcPr>
+          <w:p>
+            <w:pPr>
+              <w:spacing w:line="276" w:lineRule="auto"/>
+              <w:jc w:val="center"/>
+            </w:pPr>
+            <w:r>
+              <w:rPr>
+                <w:rFonts w:ascii="Times New Roman" w:hAnsi="Times New Roman" w:cs="Times New Roman" w:eastAsia="Times New Roman"/>
+                <w:b/>
+                <w:i w:val="0"/>
+                <w:sz w:val="26"/>
+              </w:rPr>
+              <w:t>Hoạt động của GV</w:t>
+            </w:r>
+          </w:p>
+        </w:tc>
+        <w:tc>
+          <w:tcPr>
+            <w:tcW w:type="dxa" w:w="3198"/>
+          </w:tcPr>
+          <w:p>
+            <w:pPr>
+              <w:spacing w:line="276" w:lineRule="auto"/>
+              <w:jc w:val="center"/>
+            </w:pPr>
+            <w:r>
+              <w:rPr>
+                <w:rFonts w:ascii="Times New Roman" w:hAnsi="Times New Roman" w:cs="Times New Roman" w:eastAsia="Times New Roman"/>
+                <w:b/>
+                <w:i w:val="0"/>
+                <w:sz w:val="26"/>
+              </w:rPr>
+              <w:t>Hoạt động của HS</w:t>
+            </w:r>
+          </w:p>
+        </w:tc>
+      </w:tr>
+      <w:tr>
+        <w:tc>
+          <w:tcPr>
+            <w:tcW w:type="dxa" w:w="1805"/>
+          </w:tcPr>
+          <w:p>
+            <w:pPr>
+              <w:spacing w:line="276" w:lineRule="auto"/>
+              <w:jc w:val="center"/>
+            </w:pPr>
+            <w:r>
+              <w:rPr>
+                <w:rFonts w:ascii="Times New Roman" w:hAnsi="Times New Roman" w:cs="Times New Roman" w:eastAsia="Times New Roman"/>
+                <w:b/>
+                <w:i/>
+                <w:sz w:val="26"/>
+              </w:rPr>
+              <w:t>Bước 1:</w:t>
+            </w:r>
+          </w:p>
+          <w:p>
+            <w:r>
+              <w:rPr>
+                <w:rFonts w:ascii="Times New Roman" w:hAnsi="Times New Roman" w:cs="Times New Roman" w:eastAsia="Times New Roman"/>
+                <w:b/>
+                <w:i/>
+                <w:sz w:val="26"/>
+              </w:rPr>
+              <w:t>Chuyển giao</w:t>
+            </w:r>
+          </w:p>
+          <w:p>
+            <w:r>
+              <w:rPr>
+                <w:rFonts w:ascii="Times New Roman" w:hAnsi="Times New Roman" w:cs="Times New Roman" w:eastAsia="Times New Roman"/>
+                <w:b/>
+                <w:i/>
+                <w:sz w:val="26"/>
+              </w:rPr>
+              <w:t>nhiệm vụ học tập</w:t>
+            </w:r>
+          </w:p>
+        </w:tc>
+        <w:tc>
+          <w:tcPr>
+            <w:tcW w:type="dxa" w:w="3610"/>
+          </w:tcPr>
+          <w:p>
+            <w:pPr>
+              <w:spacing w:line="276" w:lineRule="auto"/>
+            </w:pPr>
+            <w:r>
+              <w:rPr>
+                <w:rFonts w:ascii="Times New Roman" w:hAnsi="Times New Roman" w:cs="Times New Roman" w:eastAsia="Times New Roman"/>
+                <w:b w:val="0"/>
+                <w:i w:val="0"/>
+                <w:sz w:val="26"/>
+              </w:rPr>
+              <w:t>GV chiếu slide khái niệm: Thông tin (information) = ý nghĩa mà con người hiểu. Dữ liệu (data) = biểu diễn của thông tin trong máy tính.</w:t>
+            </w:r>
+          </w:p>
+        </w:tc>
+        <w:tc>
+          <w:tcPr>
+            <w:tcW w:type="dxa" w:w="3611"/>
+          </w:tcPr>
+          <w:p>
+            <w:pPr>
+              <w:spacing w:line="276" w:lineRule="auto"/>
+            </w:pPr>
+          </w:p>
+        </w:tc>
+      </w:tr>
+      <w:tr>
+        <w:tc>
+          <w:tcPr>
+            <w:tcW w:type="dxa" w:w="1805"/>
+          </w:tcPr>
+          <w:p>
+            <w:pPr>
+              <w:spacing w:line="276" w:lineRule="auto"/>
+              <w:jc w:val="center"/>
+            </w:pPr>
+            <w:r>
+              <w:rPr>
+                <w:rFonts w:ascii="Times New Roman" w:hAnsi="Times New Roman" w:cs="Times New Roman" w:eastAsia="Times New Roman"/>
+                <w:b/>
+                <w:i/>
+                <w:sz w:val="26"/>
+              </w:rPr>
+              <w:t>Bước 2:</w:t>
+            </w:r>
+          </w:p>
+          <w:p>
+            <w:r>
+              <w:rPr>
+                <w:rFonts w:ascii="Times New Roman" w:hAnsi="Times New Roman" w:cs="Times New Roman" w:eastAsia="Times New Roman"/>
+                <w:b/>
+                <w:i/>
+                <w:sz w:val="26"/>
+              </w:rPr>
+              <w:t>Học sinh tiếp nhận</w:t>
+            </w:r>
+          </w:p>
+          <w:p>
+            <w:r>
+              <w:rPr>
+                <w:rFonts w:ascii="Times New Roman" w:hAnsi="Times New Roman" w:cs="Times New Roman" w:eastAsia="Times New Roman"/>
+                <w:b/>
+                <w:i/>
+                <w:sz w:val="26"/>
+              </w:rPr>
+              <w:t>nhiệm vụ học tập</w:t>
+            </w:r>
+          </w:p>
+        </w:tc>
+        <w:tc>
+          <w:tcPr>
+            <w:tcW w:type="dxa" w:w="3610"/>
+          </w:tcPr>
+          <w:p>
+            <w:pPr>
+              <w:spacing w:line="276" w:lineRule="auto"/>
+            </w:pPr>
+            <w:r>
+              <w:rPr>
+                <w:rFonts w:ascii="Times New Roman" w:hAnsi="Times New Roman" w:cs="Times New Roman" w:eastAsia="Times New Roman"/>
+                <w:b w:val="0"/>
+                <w:i w:val="0"/>
+                <w:sz w:val="26"/>
+              </w:rPr>
+              <w:t>HS đọc SGK tr.6, gạch chân định nghĩa và ví dụ. GV hỏi: "Cho ví dụ 1 thông tin và dữ liệu tương ứng."</w:t>
+            </w:r>
+          </w:p>
+        </w:tc>
+        <w:tc>
+          <w:tcPr>
+            <w:tcW w:type="dxa" w:w="3611"/>
+          </w:tcPr>
+          <w:p>
+            <w:pPr>
+              <w:spacing w:line="276" w:lineRule="auto"/>
+            </w:pPr>
+          </w:p>
+        </w:tc>
+      </w:tr>
+      <w:tr>
+        <w:tc>
+          <w:tcPr>
+            <w:tcW w:type="dxa" w:w="1805"/>
+          </w:tcPr>
+          <w:p>
+            <w:pPr>
+              <w:spacing w:line="276" w:lineRule="auto"/>
+              <w:jc w:val="center"/>
+            </w:pPr>
+            <w:r>
+              <w:rPr>
+                <w:rFonts w:ascii="Times New Roman" w:hAnsi="Times New Roman" w:cs="Times New Roman" w:eastAsia="Times New Roman"/>
+                <w:b/>
+                <w:i/>
+                <w:sz w:val="26"/>
+              </w:rPr>
+              <w:t>Bước 3:</w:t>
+            </w:r>
+          </w:p>
+          <w:p>
+            <w:r>
+              <w:rPr>
+                <w:rFonts w:ascii="Times New Roman" w:hAnsi="Times New Roman" w:cs="Times New Roman" w:eastAsia="Times New Roman"/>
+                <w:b/>
+                <w:i/>
+                <w:sz w:val="26"/>
+              </w:rPr>
+              <w:t>Báo cáo kết quả</w:t>
+            </w:r>
+          </w:p>
+          <w:p>
+            <w:r>
+              <w:rPr>
+                <w:rFonts w:ascii="Times New Roman" w:hAnsi="Times New Roman" w:cs="Times New Roman" w:eastAsia="Times New Roman"/>
+                <w:b/>
+                <w:i/>
+                <w:sz w:val="26"/>
+              </w:rPr>
+              <w:t>hoạt động</w:t>
+            </w:r>
+          </w:p>
+        </w:tc>
+        <w:tc>
+          <w:tcPr>
+            <w:tcW w:type="dxa" w:w="3610"/>
+          </w:tcPr>
+          <w:p>
+            <w:pPr>
+              <w:spacing w:line="276" w:lineRule="auto"/>
+            </w:pPr>
+            <w:r>
+              <w:rPr>
+                <w:rFonts w:ascii="Times New Roman" w:hAnsi="Times New Roman" w:cs="Times New Roman" w:eastAsia="Times New Roman"/>
+                <w:b w:val="0"/>
+                <w:i w:val="0"/>
+                <w:sz w:val="26"/>
+              </w:rPr>
+              <w:t>HS trả lời cá nhân, GV gọi 3-4 HS. GV giới thiệu 5 dạng: số, văn bản, hình ảnh, âm thanh, video.</w:t>
+            </w:r>
+          </w:p>
+        </w:tc>
+        <w:tc>
+          <w:tcPr>
+            <w:tcW w:type="dxa" w:w="3611"/>
+          </w:tcPr>
+          <w:p>
+            <w:pPr>
+              <w:spacing w:line="276" w:lineRule="auto"/>
+            </w:pPr>
+          </w:p>
+        </w:tc>
+      </w:tr>
+      <w:tr>
+        <w:tc>
+          <w:tcPr>
+            <w:tcW w:type="dxa" w:w="1805"/>
+          </w:tcPr>
+          <w:p>
+            <w:pPr>
+              <w:spacing w:line="276" w:lineRule="auto"/>
+              <w:jc w:val="center"/>
+            </w:pPr>
+            <w:r>
+              <w:rPr>
+                <w:rFonts w:ascii="Times New Roman" w:hAnsi="Times New Roman" w:cs="Times New Roman" w:eastAsia="Times New Roman"/>
+                <w:b/>
+                <w:i/>
+                <w:sz w:val="26"/>
+              </w:rPr>
+              <w:t>Bước 4:</w:t>
+            </w:r>
+          </w:p>
+          <w:p>
+            <w:r>
+              <w:rPr>
+                <w:rFonts w:ascii="Times New Roman" w:hAnsi="Times New Roman" w:cs="Times New Roman" w:eastAsia="Times New Roman"/>
+                <w:b/>
+                <w:i/>
+                <w:sz w:val="26"/>
+              </w:rPr>
+              <w:t>Đánh giá kết quả</w:t>
+            </w:r>
+          </w:p>
+          <w:p>
+            <w:r>
+              <w:rPr>
+                <w:rFonts w:ascii="Times New Roman" w:hAnsi="Times New Roman" w:cs="Times New Roman" w:eastAsia="Times New Roman"/>
+                <w:b/>
+                <w:i/>
+                <w:sz w:val="26"/>
+              </w:rPr>
+              <w:t>thực hiện nhiệm vụ</w:t>
+            </w:r>
+          </w:p>
+        </w:tc>
+        <w:tc>
+          <w:tcPr>
+            <w:tcW w:type="dxa" w:w="3610"/>
+          </w:tcPr>
+          <w:p>
+            <w:pPr>
+              <w:spacing w:line="276" w:lineRule="auto"/>
+            </w:pPr>
+            <w:r>
+              <w:rPr>
+                <w:rFonts w:ascii="Times New Roman" w:hAnsi="Times New Roman" w:cs="Times New Roman" w:eastAsia="Times New Roman"/>
+                <w:b w:val="0"/>
+                <w:i w:val="0"/>
+                <w:sz w:val="26"/>
+              </w:rPr>
+              <w:t>GV tổng kết, HS ghi vào vở định nghĩa và bảng 5 dạng dữ liệu.</w:t>
+            </w:r>
+          </w:p>
+        </w:tc>
+        <w:tc>
+          <w:tcPr>
+            <w:tcW w:type="dxa" w:w="3611"/>
+          </w:tcPr>
+          <w:p>
+            <w:pPr>
+              <w:spacing w:line="276" w:lineRule="auto"/>
+            </w:pPr>
+          </w:p>
+        </w:tc>
+      </w:tr>
+    </w:tbl>
+    <w:p>
+      <w:pPr>
+        <w:spacing w:line="276" w:lineRule="auto"/>
+      </w:pPr>
     </w:p>
     <w:p>
       <w:pPr>
@@ -1131,93 +1721,388 @@
         <w:t>Hoạt động cá nhân, sau đó đổi phiếu kiểm tra chéo.</w:t>
       </w:r>
     </w:p>
-    <w:p>
-      <w:pPr>
-        <w:spacing w:after="0" w:line="276" w:lineRule="auto"/>
-        <w:ind w:firstLine="567"/>
-      </w:pPr>
-      <w:r>
-        <w:rPr>
-          <w:rFonts w:ascii="Times New Roman" w:hAnsi="Times New Roman" w:cs="Times New Roman" w:eastAsia="Times New Roman"/>
-          <w:i/>
-          <w:sz w:val="26"/>
-        </w:rPr>
-        <w:t>Bước 1. Chuyển giao nhiệm vụ học tập</w:t>
-      </w:r>
-      <w:r>
-        <w:rPr>
-          <w:rFonts w:ascii="Times New Roman" w:hAnsi="Times New Roman" w:cs="Times New Roman" w:eastAsia="Times New Roman"/>
-          <w:sz w:val="26"/>
-        </w:rPr>
-        <w:br/>
-        <w:t>GV phát phiếu học tập với 10 ví dụ (ảnh chụp, file MP3, bảng Excel...). HS phân loại vào đúng dạng dữ liệu.</w:t>
-      </w:r>
-    </w:p>
-    <w:p>
-      <w:pPr>
-        <w:spacing w:after="0" w:line="276" w:lineRule="auto"/>
-        <w:ind w:firstLine="567"/>
-      </w:pPr>
-      <w:r>
-        <w:rPr>
-          <w:rFonts w:ascii="Times New Roman" w:hAnsi="Times New Roman" w:cs="Times New Roman" w:eastAsia="Times New Roman"/>
-          <w:i/>
-          <w:sz w:val="26"/>
-        </w:rPr>
-        <w:t>Bước 2. Học sinh tiếp nhận nhiệm vụ học tập</w:t>
-      </w:r>
-      <w:r>
-        <w:rPr>
-          <w:rFonts w:ascii="Times New Roman" w:hAnsi="Times New Roman" w:cs="Times New Roman" w:eastAsia="Times New Roman"/>
-          <w:sz w:val="26"/>
-        </w:rPr>
-        <w:br/>
-        <w:t>HS làm việc cá nhân trong 5 phút, phân loại và viết giải thích ngắn.</w:t>
-      </w:r>
-    </w:p>
-    <w:p>
-      <w:pPr>
-        <w:spacing w:after="0" w:line="276" w:lineRule="auto"/>
-        <w:ind w:firstLine="567"/>
-      </w:pPr>
-      <w:r>
-        <w:rPr>
-          <w:rFonts w:ascii="Times New Roman" w:hAnsi="Times New Roman" w:cs="Times New Roman" w:eastAsia="Times New Roman"/>
-          <w:i/>
-          <w:sz w:val="26"/>
-        </w:rPr>
-        <w:t>Bước 3. Báo cáo kết quả hoạt động</w:t>
-      </w:r>
-      <w:r>
-        <w:rPr>
-          <w:rFonts w:ascii="Times New Roman" w:hAnsi="Times New Roman" w:cs="Times New Roman" w:eastAsia="Times New Roman"/>
-          <w:sz w:val="26"/>
-        </w:rPr>
-        <w:br/>
-        <w:t>HS đổi phiếu theo cặp, kiểm tra chéo. GV gọi 2 cặp báo cáo kết quả.</w:t>
-      </w:r>
-    </w:p>
-    <w:p>
-      <w:pPr>
-        <w:spacing w:after="0" w:line="276" w:lineRule="auto"/>
-        <w:ind w:firstLine="567"/>
-      </w:pPr>
-      <w:r>
-        <w:rPr>
-          <w:rFonts w:ascii="Times New Roman" w:hAnsi="Times New Roman" w:cs="Times New Roman" w:eastAsia="Times New Roman"/>
-          <w:i/>
-          <w:sz w:val="26"/>
-        </w:rPr>
-        <w:t>Bước 4. Đánh giá kết quả thực hiện nhiệm vụ</w:t>
-      </w:r>
-      <w:r>
-        <w:rPr>
-          <w:rFonts w:ascii="Times New Roman" w:hAnsi="Times New Roman" w:cs="Times New Roman" w:eastAsia="Times New Roman"/>
-          <w:sz w:val="26"/>
-        </w:rPr>
-        <w:br/>
-        <w:t>GV chiếu đáp án, giải thích các trường hợp khó. Tổng kết điểm cần nhớ.</w:t>
-      </w:r>
+    <w:tbl>
+      <w:tblPr>
+        <w:tblW w:type="auto" w:w="0"/>
+        <w:tblLook w:firstColumn="1" w:firstRow="1" w:lastColumn="0" w:lastRow="0" w:noHBand="0" w:noVBand="1" w:val="04A0"/>
+        <w:tblBorders>
+          <w:top w:val="single" w:sz="4" w:color="000000" w:space="0"/>
+          <w:left w:val="single" w:sz="4" w:color="000000" w:space="0"/>
+          <w:bottom w:val="single" w:sz="4" w:color="000000" w:space="0"/>
+          <w:right w:val="single" w:sz="4" w:color="000000" w:space="0"/>
+          <w:insideH w:val="single" w:sz="4" w:color="000000" w:space="0"/>
+          <w:insideV w:val="single" w:sz="4" w:color="000000" w:space="0"/>
+        </w:tblBorders>
+      </w:tblPr>
+      <w:tblGrid>
+        <w:gridCol w:w="1805"/>
+        <w:gridCol w:w="3610"/>
+        <w:gridCol w:w="3611"/>
+      </w:tblGrid>
+      <w:tblGrid>
+        <w:gridCol w:w="3198"/>
+        <w:gridCol w:w="3198"/>
+        <w:gridCol w:w="3198"/>
+      </w:tblGrid>
+      <w:tr>
+        <w:tc>
+          <w:tcPr>
+            <w:tcW w:type="dxa" w:w="3198"/>
+          </w:tcPr>
+          <w:p>
+            <w:pPr>
+              <w:spacing w:line="276" w:lineRule="auto"/>
+              <w:jc w:val="center"/>
+            </w:pPr>
+            <w:r>
+              <w:rPr>
+                <w:rFonts w:ascii="Times New Roman" w:hAnsi="Times New Roman" w:cs="Times New Roman" w:eastAsia="Times New Roman"/>
+                <w:b/>
+                <w:i w:val="0"/>
+                <w:sz w:val="26"/>
+              </w:rPr>
+              <w:t>Bước</w:t>
+            </w:r>
+          </w:p>
+        </w:tc>
+        <w:tc>
+          <w:tcPr>
+            <w:tcW w:type="dxa" w:w="3198"/>
+          </w:tcPr>
+          <w:p>
+            <w:pPr>
+              <w:spacing w:line="276" w:lineRule="auto"/>
+              <w:jc w:val="center"/>
+            </w:pPr>
+            <w:r>
+              <w:rPr>
+                <w:rFonts w:ascii="Times New Roman" w:hAnsi="Times New Roman" w:cs="Times New Roman" w:eastAsia="Times New Roman"/>
+                <w:b/>
+                <w:i w:val="0"/>
+                <w:sz w:val="26"/>
+              </w:rPr>
+              <w:t>Hoạt động của GV</w:t>
+            </w:r>
+          </w:p>
+        </w:tc>
+        <w:tc>
+          <w:tcPr>
+            <w:tcW w:type="dxa" w:w="3198"/>
+          </w:tcPr>
+          <w:p>
+            <w:pPr>
+              <w:spacing w:line="276" w:lineRule="auto"/>
+              <w:jc w:val="center"/>
+            </w:pPr>
+            <w:r>
+              <w:rPr>
+                <w:rFonts w:ascii="Times New Roman" w:hAnsi="Times New Roman" w:cs="Times New Roman" w:eastAsia="Times New Roman"/>
+                <w:b/>
+                <w:i w:val="0"/>
+                <w:sz w:val="26"/>
+              </w:rPr>
+              <w:t>Hoạt động của HS</w:t>
+            </w:r>
+          </w:p>
+        </w:tc>
+      </w:tr>
+      <w:tr>
+        <w:tc>
+          <w:tcPr>
+            <w:tcW w:type="dxa" w:w="1805"/>
+          </w:tcPr>
+          <w:p>
+            <w:pPr>
+              <w:spacing w:line="276" w:lineRule="auto"/>
+              <w:jc w:val="center"/>
+            </w:pPr>
+            <w:r>
+              <w:rPr>
+                <w:rFonts w:ascii="Times New Roman" w:hAnsi="Times New Roman" w:cs="Times New Roman" w:eastAsia="Times New Roman"/>
+                <w:b/>
+                <w:i/>
+                <w:sz w:val="26"/>
+              </w:rPr>
+              <w:t>Bước 1:</w:t>
+            </w:r>
+          </w:p>
+          <w:p>
+            <w:r>
+              <w:rPr>
+                <w:rFonts w:ascii="Times New Roman" w:hAnsi="Times New Roman" w:cs="Times New Roman" w:eastAsia="Times New Roman"/>
+                <w:b/>
+                <w:i/>
+                <w:sz w:val="26"/>
+              </w:rPr>
+              <w:t>Chuyển giao</w:t>
+            </w:r>
+          </w:p>
+          <w:p>
+            <w:r>
+              <w:rPr>
+                <w:rFonts w:ascii="Times New Roman" w:hAnsi="Times New Roman" w:cs="Times New Roman" w:eastAsia="Times New Roman"/>
+                <w:b/>
+                <w:i/>
+                <w:sz w:val="26"/>
+              </w:rPr>
+              <w:t>nhiệm vụ học tập</w:t>
+            </w:r>
+          </w:p>
+        </w:tc>
+        <w:tc>
+          <w:tcPr>
+            <w:tcW w:type="dxa" w:w="3610"/>
+          </w:tcPr>
+          <w:p>
+            <w:pPr>
+              <w:spacing w:line="276" w:lineRule="auto"/>
+            </w:pPr>
+            <w:r>
+              <w:rPr>
+                <w:rFonts w:ascii="Times New Roman" w:hAnsi="Times New Roman" w:cs="Times New Roman" w:eastAsia="Times New Roman"/>
+                <w:b w:val="0"/>
+                <w:i w:val="0"/>
+                <w:sz w:val="26"/>
+              </w:rPr>
+              <w:t>GV phát phiếu học tập với 10 ví dụ (ảnh chụp, file MP3, bảng Excel...). HS phân loại vào đúng dạng dữ liệu.</w:t>
+            </w:r>
+          </w:p>
+        </w:tc>
+        <w:tc>
+          <w:tcPr>
+            <w:tcW w:type="dxa" w:w="3611"/>
+          </w:tcPr>
+          <w:p>
+            <w:pPr>
+              <w:spacing w:line="276" w:lineRule="auto"/>
+            </w:pPr>
+          </w:p>
+        </w:tc>
+      </w:tr>
+      <w:tr>
+        <w:tc>
+          <w:tcPr>
+            <w:tcW w:type="dxa" w:w="1805"/>
+          </w:tcPr>
+          <w:p>
+            <w:pPr>
+              <w:spacing w:line="276" w:lineRule="auto"/>
+              <w:jc w:val="center"/>
+            </w:pPr>
+            <w:r>
+              <w:rPr>
+                <w:rFonts w:ascii="Times New Roman" w:hAnsi="Times New Roman" w:cs="Times New Roman" w:eastAsia="Times New Roman"/>
+                <w:b/>
+                <w:i/>
+                <w:sz w:val="26"/>
+              </w:rPr>
+              <w:t>Bước 2:</w:t>
+            </w:r>
+          </w:p>
+          <w:p>
+            <w:r>
+              <w:rPr>
+                <w:rFonts w:ascii="Times New Roman" w:hAnsi="Times New Roman" w:cs="Times New Roman" w:eastAsia="Times New Roman"/>
+                <w:b/>
+                <w:i/>
+                <w:sz w:val="26"/>
+              </w:rPr>
+              <w:t>Học sinh tiếp nhận</w:t>
+            </w:r>
+          </w:p>
+          <w:p>
+            <w:r>
+              <w:rPr>
+                <w:rFonts w:ascii="Times New Roman" w:hAnsi="Times New Roman" w:cs="Times New Roman" w:eastAsia="Times New Roman"/>
+                <w:b/>
+                <w:i/>
+                <w:sz w:val="26"/>
+              </w:rPr>
+              <w:t>nhiệm vụ học tập</w:t>
+            </w:r>
+          </w:p>
+        </w:tc>
+        <w:tc>
+          <w:tcPr>
+            <w:tcW w:type="dxa" w:w="3610"/>
+          </w:tcPr>
+          <w:p>
+            <w:pPr>
+              <w:spacing w:line="276" w:lineRule="auto"/>
+            </w:pPr>
+            <w:r>
+              <w:rPr>
+                <w:rFonts w:ascii="Times New Roman" w:hAnsi="Times New Roman" w:cs="Times New Roman" w:eastAsia="Times New Roman"/>
+                <w:b w:val="0"/>
+                <w:i w:val="0"/>
+                <w:sz w:val="26"/>
+              </w:rPr>
+              <w:t>HS làm việc cá nhân trong 5 phút, phân loại và viết giải thích ngắn.</w:t>
+            </w:r>
+          </w:p>
+        </w:tc>
+        <w:tc>
+          <w:tcPr>
+            <w:tcW w:type="dxa" w:w="3611"/>
+          </w:tcPr>
+          <w:p>
+            <w:pPr>
+              <w:spacing w:line="276" w:lineRule="auto"/>
+            </w:pPr>
+          </w:p>
+        </w:tc>
+      </w:tr>
+      <w:tr>
+        <w:tc>
+          <w:tcPr>
+            <w:tcW w:type="dxa" w:w="1805"/>
+          </w:tcPr>
+          <w:p>
+            <w:pPr>
+              <w:spacing w:line="276" w:lineRule="auto"/>
+              <w:jc w:val="center"/>
+            </w:pPr>
+            <w:r>
+              <w:rPr>
+                <w:rFonts w:ascii="Times New Roman" w:hAnsi="Times New Roman" w:cs="Times New Roman" w:eastAsia="Times New Roman"/>
+                <w:b/>
+                <w:i/>
+                <w:sz w:val="26"/>
+              </w:rPr>
+              <w:t>Bước 3:</w:t>
+            </w:r>
+          </w:p>
+          <w:p>
+            <w:r>
+              <w:rPr>
+                <w:rFonts w:ascii="Times New Roman" w:hAnsi="Times New Roman" w:cs="Times New Roman" w:eastAsia="Times New Roman"/>
+                <w:b/>
+                <w:i/>
+                <w:sz w:val="26"/>
+              </w:rPr>
+              <w:t>Báo cáo kết quả</w:t>
+            </w:r>
+          </w:p>
+          <w:p>
+            <w:r>
+              <w:rPr>
+                <w:rFonts w:ascii="Times New Roman" w:hAnsi="Times New Roman" w:cs="Times New Roman" w:eastAsia="Times New Roman"/>
+                <w:b/>
+                <w:i/>
+                <w:sz w:val="26"/>
+              </w:rPr>
+              <w:t>hoạt động</w:t>
+            </w:r>
+          </w:p>
+        </w:tc>
+        <w:tc>
+          <w:tcPr>
+            <w:tcW w:type="dxa" w:w="3610"/>
+          </w:tcPr>
+          <w:p>
+            <w:pPr>
+              <w:spacing w:line="276" w:lineRule="auto"/>
+            </w:pPr>
+            <w:r>
+              <w:rPr>
+                <w:rFonts w:ascii="Times New Roman" w:hAnsi="Times New Roman" w:cs="Times New Roman" w:eastAsia="Times New Roman"/>
+                <w:b w:val="0"/>
+                <w:i w:val="0"/>
+                <w:sz w:val="26"/>
+              </w:rPr>
+              <w:t>HS đổi phiếu theo cặp, kiểm tra chéo. GV gọi 2 cặp báo cáo kết quả.</w:t>
+            </w:r>
+          </w:p>
+        </w:tc>
+        <w:tc>
+          <w:tcPr>
+            <w:tcW w:type="dxa" w:w="3611"/>
+          </w:tcPr>
+          <w:p>
+            <w:pPr>
+              <w:spacing w:line="276" w:lineRule="auto"/>
+            </w:pPr>
+          </w:p>
+        </w:tc>
+      </w:tr>
+      <w:tr>
+        <w:tc>
+          <w:tcPr>
+            <w:tcW w:type="dxa" w:w="1805"/>
+          </w:tcPr>
+          <w:p>
+            <w:pPr>
+              <w:spacing w:line="276" w:lineRule="auto"/>
+              <w:jc w:val="center"/>
+            </w:pPr>
+            <w:r>
+              <w:rPr>
+                <w:rFonts w:ascii="Times New Roman" w:hAnsi="Times New Roman" w:cs="Times New Roman" w:eastAsia="Times New Roman"/>
+                <w:b/>
+                <w:i/>
+                <w:sz w:val="26"/>
+              </w:rPr>
+              <w:t>Bước 4:</w:t>
+            </w:r>
+          </w:p>
+          <w:p>
+            <w:r>
+              <w:rPr>
+                <w:rFonts w:ascii="Times New Roman" w:hAnsi="Times New Roman" w:cs="Times New Roman" w:eastAsia="Times New Roman"/>
+                <w:b/>
+                <w:i/>
+                <w:sz w:val="26"/>
+              </w:rPr>
+              <w:t>Đánh giá kết quả</w:t>
+            </w:r>
+          </w:p>
+          <w:p>
+            <w:r>
+              <w:rPr>
+                <w:rFonts w:ascii="Times New Roman" w:hAnsi="Times New Roman" w:cs="Times New Roman" w:eastAsia="Times New Roman"/>
+                <w:b/>
+                <w:i/>
+                <w:sz w:val="26"/>
+              </w:rPr>
+              <w:t>thực hiện nhiệm vụ</w:t>
+            </w:r>
+          </w:p>
+        </w:tc>
+        <w:tc>
+          <w:tcPr>
+            <w:tcW w:type="dxa" w:w="3610"/>
+          </w:tcPr>
+          <w:p>
+            <w:pPr>
+              <w:spacing w:line="276" w:lineRule="auto"/>
+            </w:pPr>
+            <w:r>
+              <w:rPr>
+                <w:rFonts w:ascii="Times New Roman" w:hAnsi="Times New Roman" w:cs="Times New Roman" w:eastAsia="Times New Roman"/>
+                <w:b w:val="0"/>
+                <w:i w:val="0"/>
+                <w:sz w:val="26"/>
+              </w:rPr>
+              <w:t>GV chiếu đáp án, giải thích các trường hợp khó. Tổng kết điểm cần nhớ.</w:t>
+            </w:r>
+          </w:p>
+        </w:tc>
+        <w:tc>
+          <w:tcPr>
+            <w:tcW w:type="dxa" w:w="3611"/>
+          </w:tcPr>
+          <w:p>
+            <w:pPr>
+              <w:spacing w:line="276" w:lineRule="auto"/>
+            </w:pPr>
+          </w:p>
+        </w:tc>
+      </w:tr>
+    </w:tbl>
+    <w:p>
+      <w:pPr>
+        <w:spacing w:line="276" w:lineRule="auto"/>
+      </w:pPr>
     </w:p>
     <w:p>
       <w:pPr>
@@ -1310,100 +2195,389 @@
         </w:rPr>
         <w:t xml:space="preserve">d) Tổ chức thực hiện: </w:t>
       </w:r>
-      <w:r>
-        <w:rPr>
-          <w:rFonts w:ascii="Times New Roman" w:hAnsi="Times New Roman" w:cs="Times New Roman" w:eastAsia="Times New Roman"/>
-          <w:sz w:val="26"/>
-        </w:rPr>
-      </w:r>
-    </w:p>
-    <w:p>
-      <w:pPr>
-        <w:spacing w:after="0" w:line="276" w:lineRule="auto"/>
-        <w:ind w:firstLine="567"/>
-      </w:pPr>
-      <w:r>
-        <w:rPr>
-          <w:rFonts w:ascii="Times New Roman" w:hAnsi="Times New Roman" w:cs="Times New Roman" w:eastAsia="Times New Roman"/>
-          <w:i/>
-          <w:sz w:val="26"/>
-        </w:rPr>
-        <w:t>Bước 1. Chuyển giao nhiệm vụ học tập</w:t>
-      </w:r>
-      <w:r>
-        <w:rPr>
-          <w:rFonts w:ascii="Times New Roman" w:hAnsi="Times New Roman" w:cs="Times New Roman" w:eastAsia="Times New Roman"/>
-          <w:sz w:val="26"/>
-        </w:rPr>
-        <w:br/>
-        <w:t>GV giao nhiệm vụ: Quan sát điện thoại/máy tính ở nhà, tìm ví dụ về 5 dạng dữ liệu khác nhau.</w:t>
-      </w:r>
-    </w:p>
-    <w:p>
-      <w:pPr>
-        <w:spacing w:after="0" w:line="276" w:lineRule="auto"/>
-        <w:ind w:firstLine="567"/>
-      </w:pPr>
-      <w:r>
-        <w:rPr>
-          <w:rFonts w:ascii="Times New Roman" w:hAnsi="Times New Roman" w:cs="Times New Roman" w:eastAsia="Times New Roman"/>
-          <w:i/>
-          <w:sz w:val="26"/>
-        </w:rPr>
-        <w:t>Bước 2. Học sinh tiếp nhận nhiệm vụ học tập</w:t>
-      </w:r>
-      <w:r>
-        <w:rPr>
-          <w:rFonts w:ascii="Times New Roman" w:hAnsi="Times New Roman" w:cs="Times New Roman" w:eastAsia="Times New Roman"/>
-          <w:sz w:val="26"/>
-        </w:rPr>
-        <w:br/>
-        <w:t>HS ghi nhiệm vụ vào sổ tay.</w:t>
-      </w:r>
-    </w:p>
-    <w:p>
-      <w:pPr>
-        <w:spacing w:after="0" w:line="276" w:lineRule="auto"/>
-        <w:ind w:firstLine="567"/>
-      </w:pPr>
-      <w:r>
-        <w:rPr>
-          <w:rFonts w:ascii="Times New Roman" w:hAnsi="Times New Roman" w:cs="Times New Roman" w:eastAsia="Times New Roman"/>
-          <w:i/>
-          <w:sz w:val="26"/>
-        </w:rPr>
-        <w:t>Bước 3. Báo cáo kết quả hoạt động</w:t>
-      </w:r>
-      <w:r>
-        <w:rPr>
-          <w:rFonts w:ascii="Times New Roman" w:hAnsi="Times New Roman" w:cs="Times New Roman" w:eastAsia="Times New Roman"/>
-          <w:sz w:val="26"/>
-        </w:rPr>
-        <w:br/>
-        <w:t>HS sẽ nộp kết quả đầu tiết học sau.</w:t>
-      </w:r>
-    </w:p>
-    <w:p>
-      <w:pPr>
-        <w:spacing w:after="0" w:line="276" w:lineRule="auto"/>
-        <w:ind w:firstLine="567"/>
-      </w:pPr>
-      <w:r>
-        <w:rPr>
-          <w:rFonts w:ascii="Times New Roman" w:hAnsi="Times New Roman" w:cs="Times New Roman" w:eastAsia="Times New Roman"/>
-          <w:i/>
-          <w:sz w:val="26"/>
-        </w:rPr>
-        <w:t>Bước 4. Giáo viên nhắc nhở nhiệm vụ về nhà</w:t>
-      </w:r>
-      <w:r>
-        <w:rPr>
-          <w:rFonts w:ascii="Times New Roman" w:hAnsi="Times New Roman" w:cs="Times New Roman" w:eastAsia="Times New Roman"/>
-          <w:sz w:val="26"/>
-        </w:rPr>
-        <w:br/>
-        <w:t>GV nhắc nhở: Ghi rõ tên dữ liệu, dạng dữ liệu và ý nghĩa (thông tin) của nó.</w:t>
-      </w:r>
+    </w:p>
+    <w:tbl>
+      <w:tblPr>
+        <w:tblW w:type="auto" w:w="0"/>
+        <w:tblLook w:firstColumn="1" w:firstRow="1" w:lastColumn="0" w:lastRow="0" w:noHBand="0" w:noVBand="1" w:val="04A0"/>
+        <w:tblBorders>
+          <w:top w:val="single" w:sz="4" w:color="000000" w:space="0"/>
+          <w:left w:val="single" w:sz="4" w:color="000000" w:space="0"/>
+          <w:bottom w:val="single" w:sz="4" w:color="000000" w:space="0"/>
+          <w:right w:val="single" w:sz="4" w:color="000000" w:space="0"/>
+          <w:insideH w:val="single" w:sz="4" w:color="000000" w:space="0"/>
+          <w:insideV w:val="single" w:sz="4" w:color="000000" w:space="0"/>
+        </w:tblBorders>
+      </w:tblPr>
+      <w:tblGrid>
+        <w:gridCol w:w="1805"/>
+        <w:gridCol w:w="3610"/>
+        <w:gridCol w:w="3611"/>
+      </w:tblGrid>
+      <w:tblGrid>
+        <w:gridCol w:w="3198"/>
+        <w:gridCol w:w="3198"/>
+        <w:gridCol w:w="3198"/>
+      </w:tblGrid>
+      <w:tr>
+        <w:tc>
+          <w:tcPr>
+            <w:tcW w:type="dxa" w:w="3198"/>
+          </w:tcPr>
+          <w:p>
+            <w:pPr>
+              <w:spacing w:line="276" w:lineRule="auto"/>
+              <w:jc w:val="center"/>
+            </w:pPr>
+            <w:r>
+              <w:rPr>
+                <w:rFonts w:ascii="Times New Roman" w:hAnsi="Times New Roman" w:cs="Times New Roman" w:eastAsia="Times New Roman"/>
+                <w:b/>
+                <w:i w:val="0"/>
+                <w:sz w:val="26"/>
+              </w:rPr>
+              <w:t>Bước</w:t>
+            </w:r>
+          </w:p>
+        </w:tc>
+        <w:tc>
+          <w:tcPr>
+            <w:tcW w:type="dxa" w:w="3198"/>
+          </w:tcPr>
+          <w:p>
+            <w:pPr>
+              <w:spacing w:line="276" w:lineRule="auto"/>
+              <w:jc w:val="center"/>
+            </w:pPr>
+            <w:r>
+              <w:rPr>
+                <w:rFonts w:ascii="Times New Roman" w:hAnsi="Times New Roman" w:cs="Times New Roman" w:eastAsia="Times New Roman"/>
+                <w:b/>
+                <w:i w:val="0"/>
+                <w:sz w:val="26"/>
+              </w:rPr>
+              <w:t>Hoạt động của GV</w:t>
+            </w:r>
+          </w:p>
+        </w:tc>
+        <w:tc>
+          <w:tcPr>
+            <w:tcW w:type="dxa" w:w="3198"/>
+          </w:tcPr>
+          <w:p>
+            <w:pPr>
+              <w:spacing w:line="276" w:lineRule="auto"/>
+              <w:jc w:val="center"/>
+            </w:pPr>
+            <w:r>
+              <w:rPr>
+                <w:rFonts w:ascii="Times New Roman" w:hAnsi="Times New Roman" w:cs="Times New Roman" w:eastAsia="Times New Roman"/>
+                <w:b/>
+                <w:i w:val="0"/>
+                <w:sz w:val="26"/>
+              </w:rPr>
+              <w:t>Hoạt động của HS</w:t>
+            </w:r>
+          </w:p>
+        </w:tc>
+      </w:tr>
+      <w:tr>
+        <w:tc>
+          <w:tcPr>
+            <w:tcW w:type="dxa" w:w="1805"/>
+          </w:tcPr>
+          <w:p>
+            <w:pPr>
+              <w:spacing w:line="276" w:lineRule="auto"/>
+              <w:jc w:val="center"/>
+            </w:pPr>
+            <w:r>
+              <w:rPr>
+                <w:rFonts w:ascii="Times New Roman" w:hAnsi="Times New Roman" w:cs="Times New Roman" w:eastAsia="Times New Roman"/>
+                <w:b/>
+                <w:i/>
+                <w:sz w:val="26"/>
+              </w:rPr>
+              <w:t>Bước 1:</w:t>
+            </w:r>
+          </w:p>
+          <w:p>
+            <w:r>
+              <w:rPr>
+                <w:rFonts w:ascii="Times New Roman" w:hAnsi="Times New Roman" w:cs="Times New Roman" w:eastAsia="Times New Roman"/>
+                <w:b/>
+                <w:i/>
+                <w:sz w:val="26"/>
+              </w:rPr>
+              <w:t>Chuyển giao</w:t>
+            </w:r>
+          </w:p>
+          <w:p>
+            <w:r>
+              <w:rPr>
+                <w:rFonts w:ascii="Times New Roman" w:hAnsi="Times New Roman" w:cs="Times New Roman" w:eastAsia="Times New Roman"/>
+                <w:b/>
+                <w:i/>
+                <w:sz w:val="26"/>
+              </w:rPr>
+              <w:t>nhiệm vụ học tập</w:t>
+            </w:r>
+          </w:p>
+        </w:tc>
+        <w:tc>
+          <w:tcPr>
+            <w:tcW w:type="dxa" w:w="3610"/>
+          </w:tcPr>
+          <w:p>
+            <w:pPr>
+              <w:spacing w:line="276" w:lineRule="auto"/>
+            </w:pPr>
+            <w:r>
+              <w:rPr>
+                <w:rFonts w:ascii="Times New Roman" w:hAnsi="Times New Roman" w:cs="Times New Roman" w:eastAsia="Times New Roman"/>
+                <w:b w:val="0"/>
+                <w:i w:val="0"/>
+                <w:sz w:val="26"/>
+              </w:rPr>
+              <w:t>GV giao nhiệm vụ: Quan sát điện thoại/máy tính ở nhà, tìm ví dụ về 5 dạng dữ liệu khác nhau.</w:t>
+            </w:r>
+          </w:p>
+        </w:tc>
+        <w:tc>
+          <w:tcPr>
+            <w:tcW w:type="dxa" w:w="3611"/>
+          </w:tcPr>
+          <w:p>
+            <w:pPr>
+              <w:spacing w:line="276" w:lineRule="auto"/>
+            </w:pPr>
+          </w:p>
+        </w:tc>
+      </w:tr>
+      <w:tr>
+        <w:tc>
+          <w:tcPr>
+            <w:tcW w:type="dxa" w:w="1805"/>
+          </w:tcPr>
+          <w:p>
+            <w:pPr>
+              <w:spacing w:line="276" w:lineRule="auto"/>
+              <w:jc w:val="center"/>
+            </w:pPr>
+            <w:r>
+              <w:rPr>
+                <w:rFonts w:ascii="Times New Roman" w:hAnsi="Times New Roman" w:cs="Times New Roman" w:eastAsia="Times New Roman"/>
+                <w:b/>
+                <w:i/>
+                <w:sz w:val="26"/>
+              </w:rPr>
+              <w:t>Bước 2:</w:t>
+            </w:r>
+          </w:p>
+          <w:p>
+            <w:r>
+              <w:rPr>
+                <w:rFonts w:ascii="Times New Roman" w:hAnsi="Times New Roman" w:cs="Times New Roman" w:eastAsia="Times New Roman"/>
+                <w:b/>
+                <w:i/>
+                <w:sz w:val="26"/>
+              </w:rPr>
+              <w:t>Học sinh tiếp nhận</w:t>
+            </w:r>
+          </w:p>
+          <w:p>
+            <w:r>
+              <w:rPr>
+                <w:rFonts w:ascii="Times New Roman" w:hAnsi="Times New Roman" w:cs="Times New Roman" w:eastAsia="Times New Roman"/>
+                <w:b/>
+                <w:i/>
+                <w:sz w:val="26"/>
+              </w:rPr>
+              <w:t>nhiệm vụ học tập</w:t>
+            </w:r>
+          </w:p>
+        </w:tc>
+        <w:tc>
+          <w:tcPr>
+            <w:tcW w:type="dxa" w:w="3610"/>
+          </w:tcPr>
+          <w:p>
+            <w:pPr>
+              <w:spacing w:line="276" w:lineRule="auto"/>
+            </w:pPr>
+            <w:r>
+              <w:rPr>
+                <w:rFonts w:ascii="Times New Roman" w:hAnsi="Times New Roman" w:cs="Times New Roman" w:eastAsia="Times New Roman"/>
+                <w:b w:val="0"/>
+                <w:i w:val="0"/>
+                <w:sz w:val="26"/>
+              </w:rPr>
+              <w:t>HS ghi nhiệm vụ vào sổ tay.</w:t>
+            </w:r>
+          </w:p>
+        </w:tc>
+        <w:tc>
+          <w:tcPr>
+            <w:tcW w:type="dxa" w:w="3611"/>
+          </w:tcPr>
+          <w:p>
+            <w:pPr>
+              <w:spacing w:line="276" w:lineRule="auto"/>
+            </w:pPr>
+          </w:p>
+        </w:tc>
+      </w:tr>
+      <w:tr>
+        <w:tc>
+          <w:tcPr>
+            <w:tcW w:type="dxa" w:w="1805"/>
+          </w:tcPr>
+          <w:p>
+            <w:pPr>
+              <w:spacing w:line="276" w:lineRule="auto"/>
+              <w:jc w:val="center"/>
+            </w:pPr>
+            <w:r>
+              <w:rPr>
+                <w:rFonts w:ascii="Times New Roman" w:hAnsi="Times New Roman" w:cs="Times New Roman" w:eastAsia="Times New Roman"/>
+                <w:b/>
+                <w:i/>
+                <w:sz w:val="26"/>
+              </w:rPr>
+              <w:t>Bước 3:</w:t>
+            </w:r>
+          </w:p>
+          <w:p>
+            <w:r>
+              <w:rPr>
+                <w:rFonts w:ascii="Times New Roman" w:hAnsi="Times New Roman" w:cs="Times New Roman" w:eastAsia="Times New Roman"/>
+                <w:b/>
+                <w:i/>
+                <w:sz w:val="26"/>
+              </w:rPr>
+              <w:t>Báo cáo kết quả</w:t>
+            </w:r>
+          </w:p>
+          <w:p>
+            <w:r>
+              <w:rPr>
+                <w:rFonts w:ascii="Times New Roman" w:hAnsi="Times New Roman" w:cs="Times New Roman" w:eastAsia="Times New Roman"/>
+                <w:b/>
+                <w:i/>
+                <w:sz w:val="26"/>
+              </w:rPr>
+              <w:t>hoạt động</w:t>
+            </w:r>
+          </w:p>
+        </w:tc>
+        <w:tc>
+          <w:tcPr>
+            <w:tcW w:type="dxa" w:w="3610"/>
+          </w:tcPr>
+          <w:p>
+            <w:pPr>
+              <w:spacing w:line="276" w:lineRule="auto"/>
+            </w:pPr>
+            <w:r>
+              <w:rPr>
+                <w:rFonts w:ascii="Times New Roman" w:hAnsi="Times New Roman" w:cs="Times New Roman" w:eastAsia="Times New Roman"/>
+                <w:b w:val="0"/>
+                <w:i w:val="0"/>
+                <w:sz w:val="26"/>
+              </w:rPr>
+              <w:t>HS sẽ nộp kết quả đầu tiết học sau.</w:t>
+            </w:r>
+          </w:p>
+        </w:tc>
+        <w:tc>
+          <w:tcPr>
+            <w:tcW w:type="dxa" w:w="3611"/>
+          </w:tcPr>
+          <w:p>
+            <w:pPr>
+              <w:spacing w:line="276" w:lineRule="auto"/>
+            </w:pPr>
+          </w:p>
+        </w:tc>
+      </w:tr>
+      <w:tr>
+        <w:tc>
+          <w:tcPr>
+            <w:tcW w:type="dxa" w:w="1805"/>
+          </w:tcPr>
+          <w:p>
+            <w:pPr>
+              <w:spacing w:line="276" w:lineRule="auto"/>
+              <w:jc w:val="center"/>
+            </w:pPr>
+            <w:r>
+              <w:rPr>
+                <w:rFonts w:ascii="Times New Roman" w:hAnsi="Times New Roman" w:cs="Times New Roman" w:eastAsia="Times New Roman"/>
+                <w:b/>
+                <w:i/>
+                <w:sz w:val="26"/>
+              </w:rPr>
+              <w:t>Bước 4:</w:t>
+            </w:r>
+          </w:p>
+          <w:p>
+            <w:r>
+              <w:rPr>
+                <w:rFonts w:ascii="Times New Roman" w:hAnsi="Times New Roman" w:cs="Times New Roman" w:eastAsia="Times New Roman"/>
+                <w:b/>
+                <w:i/>
+                <w:sz w:val="26"/>
+              </w:rPr>
+              <w:t>Giáo viên nhắc nhở</w:t>
+            </w:r>
+          </w:p>
+          <w:p>
+            <w:r>
+              <w:rPr>
+                <w:rFonts w:ascii="Times New Roman" w:hAnsi="Times New Roman" w:cs="Times New Roman" w:eastAsia="Times New Roman"/>
+                <w:b/>
+                <w:i/>
+                <w:sz w:val="26"/>
+              </w:rPr>
+              <w:t>nhiệm vụ về nhà</w:t>
+            </w:r>
+          </w:p>
+        </w:tc>
+        <w:tc>
+          <w:tcPr>
+            <w:tcW w:type="dxa" w:w="3610"/>
+          </w:tcPr>
+          <w:p>
+            <w:pPr>
+              <w:spacing w:line="276" w:lineRule="auto"/>
+            </w:pPr>
+            <w:r>
+              <w:rPr>
+                <w:rFonts w:ascii="Times New Roman" w:hAnsi="Times New Roman" w:cs="Times New Roman" w:eastAsia="Times New Roman"/>
+                <w:b w:val="0"/>
+                <w:i w:val="0"/>
+                <w:sz w:val="26"/>
+              </w:rPr>
+              <w:t>GV nhắc nhở: Ghi rõ tên dữ liệu, dạng dữ liệu và ý nghĩa (thông tin) của nó.</w:t>
+            </w:r>
+          </w:p>
+        </w:tc>
+        <w:tc>
+          <w:tcPr>
+            <w:tcW w:type="dxa" w:w="3611"/>
+          </w:tcPr>
+          <w:p>
+            <w:pPr>
+              <w:spacing w:line="276" w:lineRule="auto"/>
+            </w:pPr>
+          </w:p>
+        </w:tc>
+      </w:tr>
+    </w:tbl>
+    <w:p>
+      <w:pPr>
+        <w:spacing w:line="276" w:lineRule="auto"/>
+      </w:pPr>
     </w:p>
     <w:p>
       <w:pPr>

</xml_diff>